<commit_message>
Resolved configuration merge conflicts
</commit_message>
<xml_diff>
--- a/Backend/templates/template_mcop.docx
+++ b/Backend/templates/template_mcop.docx
@@ -2,106 +2,68 @@
 <file path=word/document.xml><?xml version="1.0" encoding="utf-8"?>
 <w:document xmlns:wpc="http://schemas.microsoft.com/office/word/2010/wordprocessingCanvas" xmlns:mo="http://schemas.microsoft.com/office/mac/office/2008/main" xmlns:mc="http://schemas.openxmlformats.org/markup-compatibility/2006" xmlns:mv="urn:schemas-microsoft-com:mac:vml" xmlns:o="urn:schemas-microsoft-com:office:office" xmlns:r="http://schemas.openxmlformats.org/officeDocument/2006/relationships" xmlns:m="http://schemas.openxmlformats.org/officeDocument/2006/math" xmlns:v="urn:schemas-microsoft-com:vml" xmlns:wp14="http://schemas.microsoft.com/office/word/2010/wordprocessingDrawing" xmlns:wp="http://schemas.openxmlformats.org/drawingml/2006/wordprocessingDrawing" xmlns:w10="urn:schemas-microsoft-com:office:word" xmlns:w="http://schemas.openxmlformats.org/wordprocessingml/2006/main" xmlns:w14="http://schemas.microsoft.com/office/word/2010/wordml" xmlns:wpg="http://schemas.microsoft.com/office/word/2010/wordprocessingGroup" xmlns:wpi="http://schemas.microsoft.com/office/word/2010/wordprocessingInk" xmlns:wne="http://schemas.microsoft.com/office/word/2006/wordml" xmlns:wps="http://schemas.microsoft.com/office/word/2010/wordprocessingShape" mc:Ignorable="w14 wp14">
   <w:body>
-    <w:p>
-      <w:pPr>
-        <w:spacing w:before="0" w:after="40"/>
-        <w:jc w:val="center"/>
-      </w:pPr>
-      <w:r>
-        <w:rPr>
-          <w:rFonts w:ascii="TAU-Marutham" w:hAnsi="TAU-Marutham"/>
-          <w:b/>
-          <w:i w:val="0"/>
-          <w:sz w:val="26"/>
-          <w:rFonts w:ascii="TAU-Marutham" w:hAnsi="TAU-Marutham" w:cs="TAU-Marutham" w:eastAsia="TAU-Marutham"/>
-        </w:rPr>
-        <w:t>ஈரோடு மாவட்ட ஆட்சித் தலைவர் மற்றும்</w:t>
-        <w:br/>
-        <w:t>மாவட்ட நிர்வாக நடுவர் அவர்களின் செயல்முறைகள்</w:t>
-      </w:r>
-    </w:p>
-    <w:p>
-      <w:pPr>
-        <w:spacing w:before="40" w:after="280"/>
-        <w:jc w:val="center"/>
-      </w:pPr>
-      <w:r>
-        <w:rPr>
-          <w:rFonts w:ascii="TAU-Marutham" w:hAnsi="TAU-Marutham"/>
-          <w:b/>
-          <w:i w:val="0"/>
-          <w:sz w:val="24"/>
-          <w:rFonts w:ascii="TAU-Marutham" w:hAnsi="TAU-Marutham" w:cs="TAU-Marutham" w:eastAsia="TAU-Marutham"/>
-        </w:rPr>
-        <w:t>முன்னிலை: {{collector_name}}</w:t>
-      </w:r>
-    </w:p>
     <w:tbl>
       <w:tblPr>
         <w:tblW w:type="auto" w:w="0"/>
-        <w:tblLayout w:type="fixed"/>
+        <w:jc w:val="center"/>
         <w:tblLook w:firstColumn="1" w:firstRow="1" w:lastColumn="0" w:lastRow="0" w:noHBand="0" w:noVBand="1" w:val="04A0"/>
+        <w:tblBorders>
+          <w:top w:val="none"/>
+          <w:left w:val="none"/>
+          <w:bottom w:val="none"/>
+          <w:right w:val="none"/>
+          <w:insideH w:val="none"/>
+          <w:insideV w:val="none"/>
+        </w:tblBorders>
       </w:tblPr>
       <w:tblGrid>
-        <w:gridCol w:w="5040"/>
-        <w:gridCol w:w="4608"/>
+        <w:gridCol w:w="4896"/>
+        <w:gridCol w:w="4896"/>
       </w:tblGrid>
       <w:tr>
         <w:tc>
           <w:tcPr>
-            <w:tcW w:type="dxa" w:w="4824"/>
-            <w:tcBorders>
-              <w:top w:val="none"/>
-              <w:left w:val="none"/>
-              <w:bottom w:val="none"/>
-              <w:right w:val="none"/>
-              <w:insideH w:val="none"/>
-              <w:insideV w:val="none"/>
-            </w:tcBorders>
+            <w:tcW w:type="dxa" w:w="4946"/>
           </w:tcPr>
           <w:p>
             <w:pPr>
-              <w:spacing w:before="0" w:after="240"/>
+              <w:spacing w:line="276" w:lineRule="auto" w:after="60" w:before="20"/>
               <w:jc w:val="left"/>
             </w:pPr>
             <w:r>
               <w:rPr>
-                <w:rFonts w:ascii="TAU-Marutham" w:hAnsi="TAU-Marutham"/>
+                <w:rFonts w:ascii="TAU-Marutham" w:hAnsi="TAU-Marutham" w:cs="TAU-Marutham" w:eastAsia="TAU-Marutham"/>
                 <w:b/>
                 <w:i w:val="0"/>
-                <w:sz w:val="23"/>
-                <w:rFonts w:ascii="TAU-Marutham" w:hAnsi="TAU-Marutham" w:cs="TAU-Marutham" w:eastAsia="TAU-Marutham"/>
+                <w:color w:val="000000"/>
+                <w:sz w:val="21"/>
               </w:rPr>
-              <w:t>ந.க. {{file_no}}/{{file_year}}/{{section_code}}</w:t>
+              <w:t>{{ roc_number }}</w:t>
             </w:r>
           </w:p>
         </w:tc>
         <w:tc>
           <w:tcPr>
-            <w:tcW w:type="dxa" w:w="4824"/>
-            <w:tcBorders>
-              <w:top w:val="none"/>
-              <w:left w:val="none"/>
-              <w:bottom w:val="none"/>
-              <w:right w:val="none"/>
-              <w:insideH w:val="none"/>
-              <w:insideV w:val="none"/>
-            </w:tcBorders>
+            <w:tcW w:type="dxa" w:w="4946"/>
           </w:tcPr>
           <w:p>
             <w:pPr>
-              <w:spacing w:before="0" w:after="240"/>
+              <w:spacing w:line="276" w:lineRule="auto" w:after="60" w:before="20"/>
               <w:jc w:val="right"/>
             </w:pPr>
             <w:r>
               <w:rPr>
-                <w:rFonts w:ascii="TAU-Marutham" w:hAnsi="TAU-Marutham"/>
-                <w:b/>
+                <w:rFonts w:ascii="TAU-Marutham" w:hAnsi="TAU-Marutham" w:cs="TAU-Marutham" w:eastAsia="TAU-Marutham"/>
+                <w:b w:val="0"/>
                 <w:i w:val="0"/>
-                <w:sz w:val="23"/>
-                <w:rFonts w:ascii="TAU-Marutham" w:hAnsi="TAU-Marutham" w:cs="TAU-Marutham" w:eastAsia="TAU-Marutham"/>
+                <w:color w:val="000000"/>
+                <w:sz w:val="21"/>
               </w:rPr>
-              <w:t>நாள்:        .05.{{file_year}}.</w:t>
+              <w:t>மாவட்ட ஆட்சியர் அலுவலகம்,</w:t>
+              <w:br/>
+              <w:t>{{ district_name }},</w:t>
+              <w:br/>
+              <w:t>நாள். {{ proceedings_date }}.</w:t>
             </w:r>
           </w:p>
         </w:tc>
@@ -109,506 +71,345 @@
     </w:tbl>
     <w:p>
       <w:pPr>
-        <w:spacing w:before="240" w:after="240" w:line="276" w:lineRule="auto"/>
+        <w:spacing w:line="276" w:lineRule="auto" w:after="40" w:before="40"/>
+        <w:jc w:val="center"/>
+      </w:pPr>
+      <w:r>
+        <w:rPr>
+          <w:rFonts w:ascii="TAU-Marutham" w:hAnsi="TAU-Marutham" w:cs="TAU-Marutham" w:eastAsia="TAU-Marutham"/>
+          <w:b/>
+          <w:i w:val="0"/>
+          <w:color w:val="000000"/>
+          <w:sz w:val="23"/>
+        </w:rPr>
+        <w:t>//குறிப்பாணை//</w:t>
+      </w:r>
+    </w:p>
+    <w:tbl>
+      <w:tblPr>
+        <w:tblW w:type="auto" w:w="0"/>
+        <w:jc w:val="center"/>
+        <w:tblLook w:firstColumn="1" w:firstRow="1" w:lastColumn="0" w:lastRow="0" w:noHBand="0" w:noVBand="1" w:val="04A0"/>
+        <w:tblBorders>
+          <w:top w:val="none"/>
+          <w:left w:val="none"/>
+          <w:bottom w:val="none"/>
+          <w:right w:val="none"/>
+          <w:insideH w:val="none"/>
+          <w:insideV w:val="none"/>
+        </w:tblBorders>
+      </w:tblPr>
+      <w:tblGrid>
+        <w:gridCol w:w="1440"/>
+        <w:gridCol w:w="8352"/>
+      </w:tblGrid>
+      <w:tr>
+        <w:tc>
+          <w:tcPr>
+            <w:tcW w:type="dxa" w:w="4946"/>
+          </w:tcPr>
+          <w:p>
+            <w:pPr>
+              <w:spacing w:line="276" w:lineRule="auto" w:after="60" w:before="20"/>
+              <w:jc w:val="left"/>
+            </w:pPr>
+            <w:r>
+              <w:rPr>
+                <w:rFonts w:ascii="TAU-Marutham" w:hAnsi="TAU-Marutham" w:cs="TAU-Marutham" w:eastAsia="TAU-Marutham"/>
+                <w:b/>
+                <w:i w:val="0"/>
+                <w:color w:val="000000"/>
+                <w:sz w:val="20"/>
+              </w:rPr>
+              <w:t>பொருள்:</w:t>
+            </w:r>
+          </w:p>
+        </w:tc>
+        <w:tc>
+          <w:tcPr>
+            <w:tcW w:type="dxa" w:w="4946"/>
+          </w:tcPr>
+          <w:p>
+            <w:pPr>
+              <w:spacing w:line="276" w:lineRule="auto" w:after="60" w:before="20"/>
+              <w:jc w:val="both"/>
+            </w:pPr>
+            <w:r>
+              <w:rPr>
+                <w:rFonts w:ascii="TAU-Marutham" w:hAnsi="TAU-Marutham" w:cs="TAU-Marutham" w:eastAsia="TAU-Marutham"/>
+                <w:b w:val="0"/>
+                <w:i w:val="0"/>
+                <w:color w:val="000000"/>
+                <w:sz w:val="20"/>
+              </w:rPr>
+              <w:t>{{ subject_text }}</w:t>
+            </w:r>
+          </w:p>
+        </w:tc>
+      </w:tr>
+      <w:tr>
+        <w:tc>
+          <w:tcPr>
+            <w:tcW w:type="dxa" w:w="4946"/>
+          </w:tcPr>
+          <w:p>
+            <w:pPr>
+              <w:spacing w:line="276" w:lineRule="auto" w:after="60" w:before="20"/>
+              <w:jc w:val="left"/>
+            </w:pPr>
+            <w:r>
+              <w:rPr>
+                <w:rFonts w:ascii="TAU-Marutham" w:hAnsi="TAU-Marutham" w:cs="TAU-Marutham" w:eastAsia="TAU-Marutham"/>
+                <w:b/>
+                <w:i w:val="0"/>
+                <w:color w:val="000000"/>
+                <w:sz w:val="20"/>
+              </w:rPr>
+              <w:t>பார்வை:</w:t>
+            </w:r>
+          </w:p>
+        </w:tc>
+        <w:tc>
+          <w:tcPr>
+            <w:tcW w:type="dxa" w:w="4946"/>
+          </w:tcPr>
+          <w:p>
+            <w:pPr>
+              <w:spacing w:line="276" w:lineRule="auto" w:after="60" w:before="20"/>
+              <w:jc w:val="left"/>
+            </w:pPr>
+            <w:r>
+              <w:rPr>
+                <w:rFonts w:ascii="TAU-Marutham" w:hAnsi="TAU-Marutham" w:cs="TAU-Marutham" w:eastAsia="TAU-Marutham"/>
+                <w:b w:val="0"/>
+                <w:i w:val="0"/>
+                <w:color w:val="000000"/>
+                <w:sz w:val="20"/>
+              </w:rPr>
+              <w:t>{{ reference_text }}</w:t>
+            </w:r>
+          </w:p>
+        </w:tc>
+      </w:tr>
+    </w:tbl>
+    <w:p>
+      <w:pPr>
+        <w:spacing w:line="276" w:lineRule="auto" w:after="60" w:before="20"/>
+        <w:jc w:val="center"/>
+      </w:pPr>
+      <w:r>
+        <w:rPr>
+          <w:rFonts w:ascii="TAU-Marutham" w:hAnsi="TAU-Marutham" w:cs="TAU-Marutham" w:eastAsia="TAU-Marutham"/>
+          <w:b w:val="0"/>
+          <w:i w:val="0"/>
+          <w:color w:val="000000"/>
+          <w:sz w:val="16"/>
+        </w:rPr>
+        <w:t>-------------------------------------------------------------------------------------------------</w:t>
+      </w:r>
+    </w:p>
+    <w:p>
+      <w:pPr>
+        <w:spacing w:line="276" w:lineRule="auto" w:after="60" w:before="20"/>
+        <w:ind w:firstLine="432"/>
         <w:jc w:val="both"/>
       </w:pPr>
       <w:r>
         <w:rPr>
-          <w:rFonts w:ascii="TAU-Marutham" w:hAnsi="TAU-Marutham"/>
-          <w:b/>
-          <w:i w:val="0"/>
-          <w:sz w:val="23"/>
           <w:rFonts w:ascii="TAU-Marutham" w:hAnsi="TAU-Marutham" w:cs="TAU-Marutham" w:eastAsia="TAU-Marutham"/>
-        </w:rPr>
-        <w:t xml:space="preserve">பொருள்: </w:t>
-      </w:r>
-      <w:r>
-        <w:rPr>
-          <w:rFonts w:ascii="TAU-Marutham" w:hAnsi="TAU-Marutham"/>
           <w:b w:val="0"/>
           <w:i w:val="0"/>
-          <w:sz w:val="23"/>
-          <w:rFonts w:ascii="TAU-Marutham" w:hAnsi="TAU-Marutham" w:cs="TAU-Marutham" w:eastAsia="TAU-Marutham"/>
+          <w:color w:val="000000"/>
+          <w:sz w:val="20"/>
         </w:rPr>
-        <w:t>வருவாய் வசூல் சட்டம் 1864 – மோட்டார் வாகனச் சட்டம் 1988 – {{district_name}} மாவட்டம் – {{taluk_name}} வட்டம் - {{defaulter_details[0].name}}, {% if defaulter_details[0].father_or_spouse_name %}{{defaulter_details[0].father_or_spouse_name}}, {% endif %}{{defaulter_details[0].door_no}}, {{defaulter_details[0].street_and_locality}}, {{taluk_name}} - மோட்டார் வாகனச் சட்டம் 1988 பிரிவு 174 - {{reference_details.issuing_authority_name}} - {{reference_details.ia_or_mp_no}} -ன் {{reference_details.case_or_file_no}} -இன் படி தொகை ரூ.{{financials.total_amount}}/- {% if financials.interest_rate %}ஐ {{financials.interest_rate}}% வட்டியுடன் {% endif %}வருவாய் வசூல் சட்டத்தின் கீழ் வசூல் செய்ய கோரியது - உத்திரவிடுதல்.</w:t>
+        <w:t>{{ order_para1 }}</w:t>
       </w:r>
     </w:p>
     <w:p>
       <w:pPr>
-        <w:spacing w:before="240" w:after="240" w:line="276" w:lineRule="auto"/>
+        <w:spacing w:line="276" w:lineRule="auto" w:after="60" w:before="20"/>
+        <w:ind w:firstLine="432"/>
         <w:jc w:val="both"/>
       </w:pPr>
       <w:r>
         <w:rPr>
-          <w:rFonts w:ascii="TAU-Marutham" w:hAnsi="TAU-Marutham"/>
-          <w:b/>
-          <w:i w:val="0"/>
-          <w:sz w:val="23"/>
           <w:rFonts w:ascii="TAU-Marutham" w:hAnsi="TAU-Marutham" w:cs="TAU-Marutham" w:eastAsia="TAU-Marutham"/>
-        </w:rPr>
-        <w:t xml:space="preserve">பார்வை: </w:t>
-      </w:r>
-      <w:r>
-        <w:rPr>
-          <w:rFonts w:ascii="TAU-Marutham" w:hAnsi="TAU-Marutham"/>
           <w:b w:val="0"/>
           <w:i w:val="0"/>
-          <w:sz w:val="23"/>
-          <w:rFonts w:ascii="TAU-Marutham" w:hAnsi="TAU-Marutham" w:cs="TAU-Marutham" w:eastAsia="TAU-Marutham"/>
+          <w:color w:val="000000"/>
+          <w:sz w:val="20"/>
         </w:rPr>
-        <w:t>{{ reference_text }}</w:t>
+        <w:t>{{ order_para2 }}</w:t>
       </w:r>
     </w:p>
     <w:p>
       <w:pPr>
-        <w:spacing w:before="80" w:after="160"/>
-        <w:jc w:val="center"/>
+        <w:spacing w:line="276" w:lineRule="auto" w:after="100" w:before="20"/>
+        <w:ind w:firstLine="432"/>
+        <w:jc w:val="both"/>
       </w:pPr>
       <w:r>
         <w:rPr>
-          <w:rFonts w:ascii="TAU-Marutham" w:hAnsi="TAU-Marutham"/>
-          <w:b/>
+          <w:rFonts w:ascii="TAU-Marutham" w:hAnsi="TAU-Marutham" w:cs="TAU-Marutham" w:eastAsia="TAU-Marutham"/>
+          <w:b w:val="0"/>
           <w:i w:val="0"/>
-          <w:sz w:val="22"/>
-          <w:rFonts w:ascii="TAU-Marutham" w:hAnsi="TAU-Marutham" w:cs="TAU-Marutham" w:eastAsia="TAU-Marutham"/>
+          <w:color w:val="000000"/>
+          <w:sz w:val="20"/>
         </w:rPr>
-        <w:t>-------</w:t>
+        <w:t>{{ order_para3 }}</w:t>
       </w:r>
     </w:p>
     <w:p>
       <w:pPr>
-        <w:spacing w:before="280" w:after="240"/>
+        <w:spacing w:line="276" w:lineRule="auto" w:after="100" w:before="20"/>
+        <w:jc w:val="right"/>
       </w:pPr>
       <w:r>
         <w:rPr>
-          <w:rFonts w:ascii="TAU-Marutham" w:hAnsi="TAU-Marutham"/>
+          <w:rFonts w:ascii="TAU-Marutham" w:hAnsi="TAU-Marutham" w:cs="TAU-Marutham" w:eastAsia="TAU-Marutham"/>
           <w:b/>
           <w:i w:val="0"/>
-          <w:sz w:val="24"/>
-          <w:rFonts w:ascii="TAU-Marutham" w:hAnsi="TAU-Marutham" w:cs="TAU-Marutham" w:eastAsia="TAU-Marutham"/>
+          <w:color w:val="000000"/>
+          <w:sz w:val="20"/>
         </w:rPr>
-        <w:t>உத்தரவு:</w:t>
+        <w:t>மாவட்ட ஆட்சித் தலைவருக்காக/</w:t>
+        <w:br/>
+        <w:t>மாவட்ட ஆட்சியரின் நேர்முக உதவியாளர்(பொது),</w:t>
+        <w:br/>
+        <w:t>{{ district_name }}.</w:t>
       </w:r>
     </w:p>
     <w:p>
       <w:pPr>
-        <w:spacing w:after="200" w:line="288" w:lineRule="auto"/>
-        <w:ind w:firstLine="576"/>
-        <w:jc w:val="both"/>
+        <w:spacing w:line="276" w:lineRule="auto" w:after="20" w:before="20"/>
+        <w:jc w:val="left"/>
       </w:pPr>
       <w:r>
         <w:rPr>
-          <w:rFonts w:ascii="TAU-Marutham" w:hAnsi="TAU-Marutham"/>
-          <w:b w:val="0"/>
+          <w:rFonts w:ascii="TAU-Marutham" w:hAnsi="TAU-Marutham" w:cs="TAU-Marutham" w:eastAsia="TAU-Marutham"/>
+          <w:b/>
           <w:i w:val="0"/>
-          <w:sz w:val="23"/>
-          <w:rFonts w:ascii="TAU-Marutham" w:hAnsi="TAU-Marutham" w:cs="TAU-Marutham" w:eastAsia="TAU-Marutham"/>
+          <w:color w:val="000000"/>
+          <w:sz w:val="20"/>
         </w:rPr>
-        <w:t>{{district_name}} மாவட்டம், {{taluk_name}} வட்டம், {{defaulter_details[0].street_and_locality}}, {{defaulter_details[0].door_no}}, என்ற முகவரியில் {{living_verb}} {{defaulter_details[0].name}}, {% if defaulter_details[0].father_or_spouse_name %}{{defaulter_details[0].father_or_spouse_name}} {% endif %}{{defaulter_suffix}} மோட்டார் வாகனச் சட்டம் 1988 பிரிவு 174, {{reference_details.issuing_authority_name}} {{reference_details.ia_or_mp_no}} -ன் {{reference_details.case_or_file_no}} -இன் படி தொகை ரூ.{{financials.total_amount}}/- {% if financials.interest_rate %}ஐ {{financials.interest_rate}}% வட்டியுடன் {% endif %}வருவாய் வசூல் சட்டத்தின் கீழ் வசூல் செய்யுமாறு பார்வையில் காணும் உத்தரவின் வாயிலாக தெரிவிக்கப்பட்டுள்ளது.</w:t>
+        <w:t>பெறுநர்:</w:t>
       </w:r>
     </w:p>
     <w:p>
       <w:pPr>
-        <w:spacing w:after="200" w:line="288" w:lineRule="auto"/>
-        <w:ind w:firstLine="576"/>
-        <w:jc w:val="both"/>
+        <w:spacing w:line="276" w:lineRule="auto" w:after="40" w:before="20"/>
+        <w:jc w:val="left"/>
       </w:pPr>
       <w:r>
         <w:rPr>
-          <w:rFonts w:ascii="TAU-Marutham" w:hAnsi="TAU-Marutham"/>
+          <w:rFonts w:ascii="TAU-Marutham" w:hAnsi="TAU-Marutham" w:cs="TAU-Marutham" w:eastAsia="TAU-Marutham"/>
           <w:b w:val="0"/>
           <w:i w:val="0"/>
-          <w:sz w:val="23"/>
-          <w:rFonts w:ascii="TAU-Marutham" w:hAnsi="TAU-Marutham" w:cs="TAU-Marutham" w:eastAsia="TAU-Marutham"/>
+          <w:color w:val="000000"/>
+          <w:sz w:val="20"/>
         </w:rPr>
-        <w:t>மேற்படி {{defaulter_details[0].name}}, {% if defaulter_details[0].father_or_spouse_name %}{{defaulter_details[0].father_or_spouse_name}} {% endif %}{{defaulter_suffix}} தொகை ரூ.{{financials.total_amount}}/- {% if financials.interest_rate %}ஐ {{financials.interest_rate}}% வட்டியுடன் {% endif %}வருவாய் நிலை ஆணை எண் 41 மற்றம் வருவாய் வசூல் சட்டம் 1864 பிரிவு 5-ன் கீழ் வசூல் செய்ய {{taluk_name}} வருவாய் வட்டாட்சியருக்கு அதிகாரம் வழங்கி இதன் மூலம் உத்திரவிடப்படுகிறது.</w:t>
+        <w:t>{{ tahsildar_recipient }}</w:t>
       </w:r>
     </w:p>
     <w:p>
       <w:pPr>
-        <w:spacing w:after="200" w:line="288" w:lineRule="auto"/>
-        <w:ind w:firstLine="576"/>
-        <w:jc w:val="both"/>
+        <w:spacing w:line="276" w:lineRule="auto" w:after="20" w:before="20"/>
+        <w:jc w:val="left"/>
       </w:pPr>
       <w:r>
         <w:rPr>
-          <w:rFonts w:ascii="TAU-Marutham" w:hAnsi="TAU-Marutham"/>
-          <w:b w:val="0"/>
+          <w:rFonts w:ascii="TAU-Marutham" w:hAnsi="TAU-Marutham" w:cs="TAU-Marutham" w:eastAsia="TAU-Marutham"/>
+          <w:b/>
           <w:i w:val="0"/>
-          <w:sz w:val="23"/>
-          <w:rFonts w:ascii="TAU-Marutham" w:hAnsi="TAU-Marutham" w:cs="TAU-Marutham" w:eastAsia="TAU-Marutham"/>
+          <w:color w:val="000000"/>
+          <w:sz w:val="20"/>
         </w:rPr>
-        <w:t>எனவே, மேற்படி முகவரியில் {{living_verb}} {{defaulter_details[0].name}}, {% if defaulter_details[0].father_or_spouse_name %}{{defaulter_details[0].father_or_spouse_name}} {% endif %}என்பவரின் {{asset_clause}} {{split_clause}}மொத்தம் தொகை ரூ.{{financials.total_amount}}/- ({{financials.amount_in_tamil_words}}) {% if financials.interest_start_date %}மற்றும் கடந்த {{financials.interest_start_date}} முதல் தொகை செலுத்தும் நாள் வரையில் {{financials.interest_rate}}% வட்டித்தொகையுடன் சேர்த்து {% endif %}வருவாய் வசூல் சட்டப்படி வசூல் செய்து “{{payment_instructions.dd_favour_of}}“ என்ற பெயரில் வங்கி வரைவோலையாக (Demand Draft) எடுத்து {{payment_instructions.dispatch_address}} என்ற அலுவலகத்திற்கு அசலினை அனுப்பி அதன் விவரத்தினை நகல் வங்கி வரைவோலையுடன் {{reference_details.issuing_authority_name}} என்ற நீதிமன்றத்திற்கும் மற்றும் இவ்வலுவலகத்திற்கும் அனுப்பி வைக்குமாறு {{taluk_name}} வருவாய் வட்டாட்சியருக்கு தெரிவிக்கப்படுகிறது.</w:t>
+        <w:t>நகல்:</w:t>
       </w:r>
     </w:p>
     <w:p>
       <w:pPr>
-        <w:spacing w:before="120" w:after="320"/>
+        <w:spacing w:line="276" w:lineRule="auto" w:after="40" w:before="20"/>
+        <w:jc w:val="left"/>
       </w:pPr>
       <w:r>
         <w:rPr>
-          <w:rFonts w:ascii="TAU-Marutham" w:hAnsi="TAU-Marutham"/>
-          <w:b/>
+          <w:rFonts w:ascii="TAU-Marutham" w:hAnsi="TAU-Marutham" w:cs="TAU-Marutham" w:eastAsia="TAU-Marutham"/>
+          <w:b w:val="0"/>
           <w:i w:val="0"/>
-          <w:sz w:val="23"/>
-          <w:rFonts w:ascii="TAU-Marutham" w:hAnsi="TAU-Marutham" w:cs="TAU-Marutham" w:eastAsia="TAU-Marutham"/>
+          <w:color w:val="000000"/>
+          <w:sz w:val="20"/>
         </w:rPr>
-        <w:t>இணைப்பு: கடித நகல்</w:t>
+        <w:t>{{ rdo_recipient }}</w:t>
       </w:r>
     </w:p>
     <w:p>
       <w:pPr>
-        <w:spacing w:after="400"/>
-        <w:jc w:val="right"/>
+        <w:spacing w:line="276" w:lineRule="auto" w:after="20" w:before="20"/>
+        <w:jc w:val="left"/>
       </w:pPr>
       <w:r>
         <w:rPr>
-          <w:rFonts w:ascii="TAU-Marutham" w:hAnsi="TAU-Marutham"/>
+          <w:rFonts w:ascii="TAU-Marutham" w:hAnsi="TAU-Marutham" w:cs="TAU-Marutham" w:eastAsia="TAU-Marutham"/>
           <w:b/>
           <w:i w:val="0"/>
-          <w:sz w:val="23"/>
-          <w:rFonts w:ascii="TAU-Marutham" w:hAnsi="TAU-Marutham" w:cs="TAU-Marutham" w:eastAsia="TAU-Marutham"/>
+          <w:color w:val="000000"/>
+          <w:sz w:val="20"/>
         </w:rPr>
-        <w:t>மாவட்ட ஆட்சித் தலைவர்,</w:t>
-        <w:br/>
-        <w:t>{{district_name}}.</w:t>
+        <w:t>நகல்:</w:t>
       </w:r>
     </w:p>
     <w:p>
       <w:pPr>
-        <w:spacing w:after="80"/>
+        <w:spacing w:line="276" w:lineRule="auto" w:after="40" w:before="20"/>
+        <w:jc w:val="left"/>
       </w:pPr>
       <w:r>
         <w:rPr>
-          <w:rFonts w:ascii="TAU-Marutham" w:hAnsi="TAU-Marutham"/>
-          <w:b/>
-          <w:i w:val="0"/>
-          <w:sz w:val="23"/>
           <w:rFonts w:ascii="TAU-Marutham" w:hAnsi="TAU-Marutham" w:cs="TAU-Marutham" w:eastAsia="TAU-Marutham"/>
-        </w:rPr>
-        <w:t xml:space="preserve">பெறுநர்: </w:t>
-      </w:r>
-      <w:r>
-        <w:rPr>
-          <w:rFonts w:ascii="TAU-Marutham" w:hAnsi="TAU-Marutham"/>
           <w:b w:val="0"/>
           <w:i w:val="0"/>
-          <w:sz w:val="23"/>
-          <w:rFonts w:ascii="TAU-Marutham" w:hAnsi="TAU-Marutham" w:cs="TAU-Marutham" w:eastAsia="TAU-Marutham"/>
+          <w:color w:val="000000"/>
+          <w:sz w:val="20"/>
         </w:rPr>
-        <w:t>வருவாய் வட்டாட்சியர், {{taluk_name}}.</w:t>
+        <w:t>{{ issuing_authority_recipient }}</w:t>
       </w:r>
     </w:p>
     <w:p>
       <w:pPr>
-        <w:spacing w:after="80"/>
+        <w:spacing w:line="276" w:lineRule="auto" w:after="20" w:before="20"/>
+        <w:jc w:val="left"/>
       </w:pPr>
       <w:r>
         <w:rPr>
-          <w:rFonts w:ascii="TAU-Marutham" w:hAnsi="TAU-Marutham"/>
+          <w:rFonts w:ascii="TAU-Marutham" w:hAnsi="TAU-Marutham" w:cs="TAU-Marutham" w:eastAsia="TAU-Marutham"/>
           <w:b/>
           <w:i w:val="0"/>
-          <w:sz w:val="23"/>
-          <w:rFonts w:ascii="TAU-Marutham" w:hAnsi="TAU-Marutham" w:cs="TAU-Marutham" w:eastAsia="TAU-Marutham"/>
+          <w:color w:val="000000"/>
+          <w:sz w:val="20"/>
         </w:rPr>
-        <w:t xml:space="preserve">நகல்  : </w:t>
-      </w:r>
-      <w:r>
-        <w:rPr>
-          <w:rFonts w:ascii="TAU-Marutham" w:hAnsi="TAU-Marutham"/>
-          <w:b w:val="0"/>
-          <w:i w:val="0"/>
-          <w:sz w:val="23"/>
-          <w:rFonts w:ascii="TAU-Marutham" w:hAnsi="TAU-Marutham" w:cs="TAU-Marutham" w:eastAsia="TAU-Marutham"/>
-        </w:rPr>
-        <w:t>வருவாய் கோட்டாட்சியர், {{district_name}}.</w:t>
+        <w:t>நகல்:</w:t>
       </w:r>
     </w:p>
     <w:p>
       <w:pPr>
-        <w:spacing w:after="80"/>
+        <w:spacing w:line="276" w:lineRule="auto" w:after="60" w:before="20"/>
+        <w:jc w:val="left"/>
       </w:pPr>
       <w:r>
         <w:rPr>
-          <w:rFonts w:ascii="TAU-Marutham" w:hAnsi="TAU-Marutham"/>
-          <w:b/>
-          <w:i w:val="0"/>
-          <w:sz w:val="23"/>
           <w:rFonts w:ascii="TAU-Marutham" w:hAnsi="TAU-Marutham" w:cs="TAU-Marutham" w:eastAsia="TAU-Marutham"/>
-        </w:rPr>
-        <w:t xml:space="preserve">நகல்  : </w:t>
-      </w:r>
-      <w:r>
-        <w:rPr>
-          <w:rFonts w:ascii="TAU-Marutham" w:hAnsi="TAU-Marutham"/>
           <w:b w:val="0"/>
           <w:i w:val="0"/>
-          <w:sz w:val="23"/>
-          <w:rFonts w:ascii="TAU-Marutham" w:hAnsi="TAU-Marutham" w:cs="TAU-Marutham" w:eastAsia="TAU-Marutham"/>
+          <w:color w:val="000000"/>
+          <w:sz w:val="20"/>
         </w:rPr>
-        <w:t>{{payment_instructions.dispatch_address}}</w:t>
-      </w:r>
-    </w:p>
-    <w:p>
-      <w:pPr>
-        <w:spacing w:after="80"/>
-      </w:pPr>
-      <w:r>
-        <w:rPr>
-          <w:rFonts w:ascii="TAU-Marutham" w:hAnsi="TAU-Marutham"/>
-          <w:b/>
-          <w:i w:val="0"/>
-          <w:sz w:val="23"/>
-          <w:rFonts w:ascii="TAU-Marutham" w:hAnsi="TAU-Marutham" w:cs="TAU-Marutham" w:eastAsia="TAU-Marutham"/>
-        </w:rPr>
-        <w:t xml:space="preserve">நகல்  : </w:t>
-      </w:r>
-      <w:r>
-        <w:rPr>
-          <w:rFonts w:ascii="TAU-Marutham" w:hAnsi="TAU-Marutham"/>
-          <w:b w:val="0"/>
-          <w:i w:val="0"/>
-          <w:sz w:val="23"/>
-          <w:rFonts w:ascii="TAU-Marutham" w:hAnsi="TAU-Marutham" w:cs="TAU-Marutham" w:eastAsia="TAU-Marutham"/>
-        </w:rPr>
-        <w:t>{{reference_details.issuing_authority_name}}</w:t>
-      </w:r>
-    </w:p>
-    <w:p>
-      <w:pPr>
-        <w:spacing w:after="80"/>
-      </w:pPr>
-      <w:r>
-        <w:rPr>
-          <w:rFonts w:ascii="TAU-Marutham" w:hAnsi="TAU-Marutham"/>
-          <w:b/>
-          <w:i w:val="0"/>
-          <w:sz w:val="23"/>
-          <w:rFonts w:ascii="TAU-Marutham" w:hAnsi="TAU-Marutham" w:cs="TAU-Marutham" w:eastAsia="TAU-Marutham"/>
-        </w:rPr>
-        <w:t xml:space="preserve">நகல்  : </w:t>
-      </w:r>
-      <w:r>
-        <w:rPr>
-          <w:rFonts w:ascii="TAU-Marutham" w:hAnsi="TAU-Marutham"/>
-          <w:b w:val="0"/>
-          <w:i w:val="0"/>
-          <w:sz w:val="23"/>
-          <w:rFonts w:ascii="TAU-Marutham" w:hAnsi="TAU-Marutham" w:cs="TAU-Marutham" w:eastAsia="TAU-Marutham"/>
-        </w:rPr>
-        <w:t>{{defaulter_details[0].name}}, {% if defaulter_details[0].father_or_spouse_name %}{{defaulter_details[0].father_or_spouse_name}}, {% endif %}{{defaulter_details[0].door_no}}, {{defaulter_details[0].street_and_locality}}, {{taluk_name}} - {{defaulter_details[0].pincode}}.</w:t>
-      </w:r>
-    </w:p>
-    <w:p>
-      <w:r>
-        <w:br w:type="page"/>
-      </w:r>
-    </w:p>
-    <w:p>
-      <w:pPr>
-        <w:spacing w:after="240"/>
-        <w:jc w:val="center"/>
-      </w:pPr>
-      <w:r>
-        <w:rPr>
-          <w:rFonts w:ascii="TAU-Marutham" w:hAnsi="TAU-Marutham"/>
-          <w:b/>
-          <w:i w:val="0"/>
-          <w:sz w:val="25"/>
-          <w:rFonts w:ascii="TAU-Marutham" w:hAnsi="TAU-Marutham" w:cs="TAU-Marutham" w:eastAsia="TAU-Marutham"/>
-        </w:rPr>
-        <w:t>//அலுவலகக் குறிப்பு//</w:t>
-      </w:r>
-    </w:p>
-    <w:p>
-      <w:pPr>
-        <w:spacing w:after="120"/>
-      </w:pPr>
-      <w:r>
-        <w:rPr>
-          <w:rFonts w:ascii="TAU-Marutham" w:hAnsi="TAU-Marutham"/>
-          <w:b/>
-          <w:i w:val="0"/>
-          <w:sz w:val="23"/>
-          <w:rFonts w:ascii="TAU-Marutham" w:hAnsi="TAU-Marutham" w:cs="TAU-Marutham" w:eastAsia="TAU-Marutham"/>
-        </w:rPr>
-        <w:t>ந.க. {{file_no}}/{{file_year}}/{{section_code}}</w:t>
-      </w:r>
-    </w:p>
-    <w:p>
-      <w:pPr>
-        <w:spacing w:before="240" w:after="240" w:line="276" w:lineRule="auto"/>
-        <w:jc w:val="both"/>
-      </w:pPr>
-      <w:r>
-        <w:rPr>
-          <w:rFonts w:ascii="TAU-Marutham" w:hAnsi="TAU-Marutham"/>
-          <w:b/>
-          <w:i w:val="0"/>
-          <w:sz w:val="23"/>
-          <w:rFonts w:ascii="TAU-Marutham" w:hAnsi="TAU-Marutham" w:cs="TAU-Marutham" w:eastAsia="TAU-Marutham"/>
-        </w:rPr>
-        <w:t xml:space="preserve">பொருள்: </w:t>
-      </w:r>
-      <w:r>
-        <w:rPr>
-          <w:rFonts w:ascii="TAU-Marutham" w:hAnsi="TAU-Marutham"/>
-          <w:b w:val="0"/>
-          <w:i w:val="0"/>
-          <w:sz w:val="23"/>
-          <w:rFonts w:ascii="TAU-Marutham" w:hAnsi="TAU-Marutham" w:cs="TAU-Marutham" w:eastAsia="TAU-Marutham"/>
-        </w:rPr>
-        <w:t>வருவாய் வசூல் சட்டம் 1864 – மோட்டார் வாகனச் சட்டம் 1988 – {{district_name}} மாவட்டம் – {{taluk_name}} வட்டம் - {{defaulter_details[0].name}}, {% if defaulter_details[0].father_or_spouse_name %}{{defaulter_details[0].father_or_spouse_name}}, {% endif %}{{defaulter_details[0].door_no}}, {{defaulter_details[0].street_and_locality}}, {{taluk_name}} - மோட்டார் வாகனச் சட்டம் 1988 பிரிவு 174 - {{reference_details.issuing_authority_name}} - {{reference_details.ia_or_mp_no}} -ன் {{reference_details.case_or_file_no}} -இன் படி தொகை ரூ.{{financials.total_amount}}/- {% if financials.interest_rate %}ஐ {{financials.interest_rate}}% வட்டியுடன் {% endif %}வருவாய் வசூல் சட்டத்தின் கீழ் வசூல் செய்ய கோரியது - உத்திரவிடுதல்.</w:t>
-      </w:r>
-    </w:p>
-    <w:p>
-      <w:pPr>
-        <w:spacing w:before="240" w:after="240" w:line="276" w:lineRule="auto"/>
-        <w:jc w:val="both"/>
-      </w:pPr>
-      <w:r>
-        <w:rPr>
-          <w:rFonts w:ascii="TAU-Marutham" w:hAnsi="TAU-Marutham"/>
-          <w:b/>
-          <w:i w:val="0"/>
-          <w:sz w:val="23"/>
-          <w:rFonts w:ascii="TAU-Marutham" w:hAnsi="TAU-Marutham" w:cs="TAU-Marutham" w:eastAsia="TAU-Marutham"/>
-        </w:rPr>
-        <w:t xml:space="preserve">பார்வை: </w:t>
-      </w:r>
-      <w:r>
-        <w:rPr>
-          <w:rFonts w:ascii="TAU-Marutham" w:hAnsi="TAU-Marutham"/>
-          <w:b w:val="0"/>
-          <w:i w:val="0"/>
-          <w:sz w:val="23"/>
-          <w:rFonts w:ascii="TAU-Marutham" w:hAnsi="TAU-Marutham" w:cs="TAU-Marutham" w:eastAsia="TAU-Marutham"/>
-        </w:rPr>
-        <w:t>{{ reference_text }}</w:t>
-      </w:r>
-    </w:p>
-    <w:p>
-      <w:pPr>
-        <w:spacing w:before="80" w:after="160"/>
-        <w:jc w:val="center"/>
-      </w:pPr>
-      <w:r>
-        <w:rPr>
-          <w:rFonts w:ascii="TAU-Marutham" w:hAnsi="TAU-Marutham"/>
-          <w:b/>
-          <w:i w:val="0"/>
-          <w:sz w:val="22"/>
-          <w:rFonts w:ascii="TAU-Marutham" w:hAnsi="TAU-Marutham" w:cs="TAU-Marutham" w:eastAsia="TAU-Marutham"/>
-        </w:rPr>
-        <w:t>-------</w:t>
-      </w:r>
-    </w:p>
-    <w:p>
-      <w:pPr>
-        <w:spacing w:before="280" w:after="240"/>
-      </w:pPr>
-      <w:r>
-        <w:rPr>
-          <w:rFonts w:ascii="TAU-Marutham" w:hAnsi="TAU-Marutham"/>
-          <w:b/>
-          <w:i w:val="0"/>
-          <w:sz w:val="24"/>
-          <w:rFonts w:ascii="TAU-Marutham" w:hAnsi="TAU-Marutham" w:cs="TAU-Marutham" w:eastAsia="TAU-Marutham"/>
-        </w:rPr>
-        <w:t>பணிந்தனுப்பப்படுகிறது:</w:t>
-      </w:r>
-    </w:p>
-    <w:p>
-      <w:pPr>
-        <w:spacing w:after="200" w:line="288" w:lineRule="auto"/>
-        <w:ind w:firstLine="576"/>
-        <w:jc w:val="both"/>
-      </w:pPr>
-      <w:r>
-        <w:rPr>
-          <w:rFonts w:ascii="TAU-Marutham" w:hAnsi="TAU-Marutham"/>
-          <w:b w:val="0"/>
-          <w:i w:val="0"/>
-          <w:sz w:val="23"/>
-          <w:rFonts w:ascii="TAU-Marutham" w:hAnsi="TAU-Marutham" w:cs="TAU-Marutham" w:eastAsia="TAU-Marutham"/>
-        </w:rPr>
-        <w:t>{{district_name}} மாவட்டம், {{taluk_name}} வட்டம், {{defaulter_details[0].street_and_locality}}, {{defaulter_details[0].door_no}}, என்ற முகவரியில் {{living_verb}} {{defaulter_details[0].name}}, {% if defaulter_details[0].father_or_spouse_name %}{{defaulter_details[0].father_or_spouse_name}}, {% endif %}{{defaulter_suffix}} மோட்டார் வாகனச் சட்டம் 1988 பிரிவு 174, {{reference_details.issuing_authority_name}} {{reference_details.ia_or_mp_no}} -ன் {{reference_details.case_or_file_no}} -இன் படி தொகை ரூ.{{financials.total_amount}}/- {% if financials.interest_rate %}ஐ {{financials.interest_rate}}% வட்டியுடன் {% endif %}வருவாய் வசூல் சட்டத்தின் கீழ் வசூல் செய்யுமாறு பார்வை 1இல் காணும் உத்தரவின் வாயிலாக தெரிவிக்கப்பட்டுள்ளது.</w:t>
-      </w:r>
-    </w:p>
-    <w:p>
-      <w:pPr>
-        <w:spacing w:after="200" w:line="288" w:lineRule="auto"/>
-        <w:ind w:firstLine="576"/>
-        <w:jc w:val="both"/>
-      </w:pPr>
-      <w:r>
-        <w:rPr>
-          <w:rFonts w:ascii="TAU-Marutham" w:hAnsi="TAU-Marutham"/>
-          <w:b w:val="0"/>
-          <w:i w:val="0"/>
-          <w:sz w:val="23"/>
-          <w:rFonts w:ascii="TAU-Marutham" w:hAnsi="TAU-Marutham" w:cs="TAU-Marutham" w:eastAsia="TAU-Marutham"/>
-        </w:rPr>
-        <w:t>மேற்படி முகவரியில் {{living_verb}} {{defaulter_details[0].name}}, {% if defaulter_details[0].father_or_spouse_name %}{{defaulter_details[0].father_or_spouse_name}} {% endif %}என்பவரின் {{asset_clause}} {{split_clause}}மொத்தம் தொகை ரூ.{{financials.total_amount}}/- ({{financials.amount_in_tamil_words}}) {% if financials.interest_start_date %}மற்றும் கடந்த {{financials.interest_start_date}} முதல் தொகை செலுத்தும் நாள் வரையில் {{financials.interest_rate}}% வட்டித்தொகையுடன் சேர்த்து {% endif %}வருவாய் வசூல் சட்டப்படி வசூல் செய்து “{{payment_instructions.dd_favour_of}}“ என்ற பெயரில் வங்கி வரைவோலையாக (Demand Draft) எடுத்து {{payment_instructions.dispatch_address}} என்ற அலுவலகத்திற்கு அசலினை அனுப்பி அதன் விவரத்தினை நகல் வங்கி வரைவோலையுடன் {{reference_details.issuing_authority_name}} என்ற நீதிமன்றத்திற்கும் மற்றும் இவ்வலுவலகத்திற்கும் அனுப்பி வைக்குமாறு {{taluk_name}} வருவாய் வட்டாட்சியருக்கு தெரிவிக்கலாம்.</w:t>
-      </w:r>
-    </w:p>
-    <w:p>
-      <w:pPr>
-        <w:spacing w:after="200" w:line="288" w:lineRule="auto"/>
-        <w:ind w:firstLine="576"/>
-        <w:jc w:val="both"/>
-      </w:pPr>
-      <w:r>
-        <w:rPr>
-          <w:rFonts w:ascii="TAU-Marutham" w:hAnsi="TAU-Marutham"/>
-          <w:b w:val="0"/>
-          <w:i w:val="0"/>
-          <w:sz w:val="23"/>
-          <w:rFonts w:ascii="TAU-Marutham" w:hAnsi="TAU-Marutham" w:cs="TAU-Marutham" w:eastAsia="TAU-Marutham"/>
-        </w:rPr>
-        <w:t>எனவே மேற்படி தொகையை வருவாய் வசூல் சட்டம் 1864 பிரிவு 5 / வருவாய் நிலை ஆணை எண்.41-ன் கீழ் வசூல் செய்ய {{taluk_name}} வருவாய் வட்டாட்சியருக்கு அதிகாரம் வழங்கி இதன் மூலம் உத்திரவிடலாம்.</w:t>
-      </w:r>
-    </w:p>
-    <w:p>
-      <w:pPr>
-        <w:spacing w:after="200" w:line="288" w:lineRule="auto"/>
-        <w:ind w:firstLine="576"/>
-        <w:jc w:val="both"/>
-      </w:pPr>
-      <w:r>
-        <w:rPr>
-          <w:rFonts w:ascii="TAU-Marutham" w:hAnsi="TAU-Marutham"/>
-          <w:b w:val="0"/>
-          <w:i w:val="0"/>
-          <w:sz w:val="23"/>
-          <w:rFonts w:ascii="TAU-Marutham" w:hAnsi="TAU-Marutham" w:cs="TAU-Marutham" w:eastAsia="TAU-Marutham"/>
-        </w:rPr>
-        <w:t>உத்திரவினை எதிர்நோக்கி செயல்முறை வரைவு ஒப்புதலுக்காக மாவட்ட ஆட்சித்தலைவர் அவர்களுக்கு பணிவுடன் சமர்ப்பிக்கப்படுகிறது.</w:t>
-      </w:r>
-    </w:p>
-    <w:p>
-      <w:pPr>
-        <w:spacing w:before="400"/>
-        <w:jc w:val="right"/>
-      </w:pPr>
-      <w:r>
-        <w:rPr>
-          <w:rFonts w:ascii="TAU-Marutham" w:hAnsi="TAU-Marutham"/>
-          <w:b/>
-          <w:i w:val="0"/>
-          <w:sz w:val="22"/>
-          <w:rFonts w:ascii="TAU-Marutham" w:hAnsi="TAU-Marutham" w:cs="TAU-Marutham" w:eastAsia="TAU-Marutham"/>
-        </w:rPr>
-        <w:t>ஒப்பம்/–</w:t>
-        <w:br/>
-        <w:t>பிரிவு எழுத்தர் / கண்காணிப்பாளர்</w:t>
-        <w:br/>
-        <w:t>{{section_code}} பிரிவு, மாவட்ட ஆட்சியர் அலுவலகம், {{district_name}}.</w:t>
+        <w:t>{{ defaulter_address_block }}</w:t>
       </w:r>
     </w:p>
     <w:sectPr>
-      <w:pgSz w:w="12240" w:h="15840"/>
-      <w:pgMar w:top="1296" w:right="1296" w:bottom="1296" w:left="1296" w:header="720" w:footer="720" w:gutter="0"/>
+      <w:pgSz w:w="11909" w:h="16834"/>
+      <w:pgMar w:top="720" w:right="1008" w:bottom="720" w:left="1008" w:header="720" w:footer="720" w:gutter="0"/>
       <w:cols w:space="720"/>
       <w:docGrid w:linePitch="360"/>
     </w:sectPr>

</xml_diff>